<commit_message>
fixed rss feed to all one big group of sources
</commit_message>
<xml_diff>
--- a/GCC_Dashboard_PRD.docx
+++ b/GCC_Dashboard_PRD.docx
@@ -288,7 +288,7 @@
                 <w:sz w:val="20"/>
                 <w:szCs w:val="20"/>
               </w:rPr>
-              <w:t xml:space="preserve">v1.0 — Initial Release</w:t>
+              <w:t xml:space="preserve">v1.1 — RSS architecture refactor</w:t>
             </w:r>
           </w:p>
         </w:tc>
@@ -858,7 +858,7 @@
           <w:sz w:val="22"/>
           <w:szCs w:val="22"/>
         </w:rPr>
-        <w:t xml:space="preserve">A real-time news feed surfacing AI in education content from 8+ RSS sources</w:t>
+        <w:t xml:space="preserve">A real-time news feed surfacing AI in education content from 56 RSS sources across five subject tabs</w:t>
       </w:r>
     </w:p>
     <w:p>
@@ -4899,7 +4899,7 @@
           <w:sz w:val="22"/>
           <w:szCs w:val="22"/>
         </w:rPr>
-        <w:t xml:space="preserve">RSS via AllOrigins CORS proxy — live news feed from 8+ sources</w:t>
+        <w:t xml:space="preserve">RSS via three-proxy waterfall (rss2json → allorigins → corsproxy.io) — 56-source shared pool, keyword classifier routes articles to tabs, top 15 per tab</w:t>
       </w:r>
     </w:p>
     <w:p>
@@ -7530,7 +7530,7 @@
                 <w:sz w:val="20"/>
                 <w:szCs w:val="20"/>
               </w:rPr>
-              <w:t xml:space="preserve">RSS aggregator pulling from 8+ AI-in-education sources via AllOrigins proxy; pin articles; mark read</w:t>
+              <w:t xml:space="preserve">56-source shared RSS pool fetched once; keyword classifier scores each article and routes to the most relevant tab; top 15 per tab displayed; pin articles; mark read</w:t>
             </w:r>
           </w:p>
         </w:tc>
@@ -7605,7 +7605,7 @@
                 <w:sz w:val="20"/>
                 <w:szCs w:val="20"/>
               </w:rPr>
-              <w:t xml:space="preserve">AllOrigins CORS proxy handles cross-origin RSS</w:t>
+              <w:t xml:space="preserve">rss2json primary; allorigins + corsproxy.io fallbacks; single fetchInFlight promise prevents duplicate fetches; homeTab is tiebreaker only</w:t>
             </w:r>
           </w:p>
         </w:tc>
@@ -16253,7 +16253,7 @@
                 <w:sz w:val="20"/>
                 <w:szCs w:val="20"/>
               </w:rPr>
-              <w:t xml:space="preserve">News feed loads articles from 8+ sources; pin and read-state persist; articles link out to source</w:t>
+              <w:t xml:space="preserve">News feed loads articles from 56 sources; classifier routes to correct tab; pin and read-state persist; articles link out to source</w:t>
             </w:r>
           </w:p>
         </w:tc>
@@ -19021,7 +19021,7 @@
           <w:sz w:val="22"/>
           <w:szCs w:val="22"/>
         </w:rPr>
-        <w:t xml:space="preserve">News feed requires internet connection (AllOrigins RSS proxy). Graceful fallback if offline.</w:t>
+        <w:t xml:space="preserve">News feed requires internet connection (rss2json/allorigins/corsproxy.io proxy waterfall). Graceful fallback if offline.</w:t>
       </w:r>
     </w:p>
     <w:p>

</xml_diff>